<commit_message>
Wake guard on page load, S7 shop contact, deployment docs
</commit_message>
<xml_diff>
--- a/docs/Rebooter_AI_Deliverable.docx
+++ b/docs/Rebooter_AI_Deliverable.docx
@@ -6245,15 +6245,14 @@
                 <w:sz w:val="28"/>
                 <w:szCs w:val="28"/>
               </w:rPr>
-              <w:t>ChromaDB</w:t>
-            </w:r>
-            <w:proofErr w:type="spellEnd"/>
-            <w:r>
-              <w:rPr>
-                <w:sz w:val="28"/>
-                <w:szCs w:val="28"/>
-              </w:rPr>
-              <w:t xml:space="preserve"> + multilingual-e5-small</w:t>
+              <w:t xml:space="preserve">ChromaDB + multilingual-e5-small (บนเครื่อง) · text-embedding-3-small ผ่าน OpenRouter (บน Render)</w:t>
+            </w:r>
+            <w:proofErr w:type="spellEnd"/>
+            <w:r>
+              <w:rPr>
+                <w:sz w:val="28"/>
+                <w:szCs w:val="28"/>
+              </w:rPr>
             </w:r>
           </w:p>
         </w:tc>
@@ -7621,47 +7620,42 @@
                 <w:sz w:val="28"/>
                 <w:szCs w:val="28"/>
               </w:rPr>
-              <w:t xml:space="preserve">Guard 3 </w:t>
-            </w:r>
-            <w:proofErr w:type="spellStart"/>
-            <w:r>
-              <w:rPr>
-                <w:sz w:val="28"/>
-                <w:szCs w:val="28"/>
-              </w:rPr>
-              <w:t>ชั้น</w:t>
-            </w:r>
-            <w:proofErr w:type="spellEnd"/>
-            <w:r>
-              <w:rPr>
-                <w:sz w:val="28"/>
-                <w:szCs w:val="28"/>
-              </w:rPr>
-              <w:t xml:space="preserve">, </w:t>
-            </w:r>
-            <w:proofErr w:type="spellStart"/>
-            <w:r>
-              <w:rPr>
-                <w:sz w:val="28"/>
-                <w:szCs w:val="28"/>
-              </w:rPr>
-              <w:t>pytest</w:t>
-            </w:r>
-            <w:proofErr w:type="spellEnd"/>
-            <w:r>
-              <w:rPr>
-                <w:sz w:val="28"/>
-                <w:szCs w:val="28"/>
-              </w:rPr>
-              <w:t xml:space="preserve"> 54 </w:t>
-            </w:r>
-            <w:proofErr w:type="spellStart"/>
-            <w:r>
-              <w:rPr>
-                <w:sz w:val="28"/>
-                <w:szCs w:val="28"/>
-              </w:rPr>
-              <w:t>กรณี</w:t>
+              <w:t xml:space="preserve">Guard 3 ชั้น, pytest Guard 71 + Backend 22 กรณี</w:t>
+            </w:r>
+            <w:proofErr w:type="spellStart"/>
+            <w:r>
+              <w:rPr>
+                <w:sz w:val="28"/>
+                <w:szCs w:val="28"/>
+              </w:rPr>
+            </w:r>
+            <w:proofErr w:type="spellEnd"/>
+            <w:r>
+              <w:rPr>
+                <w:sz w:val="28"/>
+                <w:szCs w:val="28"/>
+              </w:rPr>
+            </w:r>
+            <w:proofErr w:type="spellStart"/>
+            <w:r>
+              <w:rPr>
+                <w:sz w:val="28"/>
+                <w:szCs w:val="28"/>
+              </w:rPr>
+            </w:r>
+            <w:proofErr w:type="spellEnd"/>
+            <w:r>
+              <w:rPr>
+                <w:sz w:val="28"/>
+                <w:szCs w:val="28"/>
+              </w:rPr>
+            </w:r>
+            <w:proofErr w:type="spellStart"/>
+            <w:r>
+              <w:rPr>
+                <w:sz w:val="28"/>
+                <w:szCs w:val="28"/>
+              </w:rPr>
             </w:r>
             <w:proofErr w:type="spellEnd"/>
           </w:p>
@@ -8277,6 +8271,16 @@
           <w:szCs w:val="28"/>
         </w:rPr>
         <w:t xml:space="preserve"> eval/results/</w:t>
+      </w:r>
+      <w:r>
+        <w:rPr>
+          <w:i/>
+          <w:iCs/>
+          <w:color w:val="555555"/>
+          <w:sz w:val="28"/>
+          <w:szCs w:val="28"/>
+        </w:rPr>
+        <w:t xml:space="preserve"> · ผลชุดนี้ทดสอบบนเครื่อง (embedding multilingual-e5-small) ผลของเวอร์ชันออนไลน์อยู่ในหัวข้อ 7</w:t>
       </w:r>
     </w:p>
     <w:tbl>
@@ -17177,6 +17181,13 @@
               </w:rPr>
               <w:t>คำตอบที่เตือนว่าป๊อปอัปไวรัสเป็นการหลอกลวงถูกบล็อกขาออก</w:t>
             </w:r>
+            <w:r>
+              <w:rPr>
+                <w:sz w:val="28"/>
+                <w:szCs w:val="28"/>
+              </w:rPr>
+              <w:t xml:space="preserve"> · หลังขึ้น Render พบเพิ่ม: “ขอเบอร์ของร้าน” ถูกบล็อกเป็นหมวด S7 (ข้อมูลส่วนบุคคล) ทั้งที่เป็นข้อมูลสาธารณะของร้าน</w:t>
+            </w:r>
             <w:proofErr w:type="spellEnd"/>
           </w:p>
         </w:tc>
@@ -17445,6 +17456,13 @@
               </w:rPr>
               <w:t>กรณี</w:t>
             </w:r>
+            <w:r>
+              <w:rPr>
+                <w:sz w:val="28"/>
+                <w:szCs w:val="28"/>
+              </w:rPr>
+              <w:t xml:space="preserve"> · เพิ่ม contact_override: หมวด S7 ผ่านได้เฉพาะเมื่อถามหรือตอบช่องทางติดต่อของร้านที่อยู่ในคลังความรู้ เบอร์อื่นหรือข้อมูลลูกค้าคนอื่นยังถูกบล็อก (unit test 8 กรณี)</w:t>
+            </w:r>
             <w:proofErr w:type="spellEnd"/>
           </w:p>
         </w:tc>
@@ -17504,6 +17522,13 @@
                 <w:szCs w:val="28"/>
               </w:rPr>
               <w:t>ยังถูกบล็อก</w:t>
+            </w:r>
+            <w:r>
+              <w:rPr>
+                <w:sz w:val="28"/>
+                <w:szCs w:val="28"/>
+              </w:rPr>
+              <w:t xml:space="preserve"> · ถามเบอร์ร้านได้แล้ว</w:t>
             </w:r>
             <w:proofErr w:type="spellEnd"/>
           </w:p>
@@ -20765,6 +20790,225 @@
       </w:tr>
     </w:tbl>
     <w:p/>
+    <w:p>
+      <w:pPr>
+        <w:pStyle w:val="Heading1"/>
+        <w:keepNext/>
+        <w:pageBreakBefore/>
+        <w:spacing w:before="360" w:after="160"/>
+      </w:pPr>
+      <w:r>
+        <w:rPr>
+          <w:b/>
+          <w:bCs/>
+          <w:color w:val="0B6B58"/>
+          <w:sz w:val="44"/>
+          <w:szCs w:val="44"/>
+        </w:rPr>
+        <w:lastRenderedPageBreak/>
+        <w:t xml:space="preserve">7. การติดตั้งใช้งาน (Deployment)</w:t>
+      </w:r>
+      <w:proofErr w:type="spellStart"/>
+      <w:r>
+        <w:rPr>
+          <w:b/>
+          <w:bCs/>
+          <w:color w:val="0B6B58"/>
+          <w:sz w:val="44"/>
+          <w:szCs w:val="44"/>
+        </w:rPr>
+      </w:r>
+      <w:proofErr w:type="spellEnd"/>
+      <w:r>
+        <w:rPr>
+          <w:b/>
+          <w:bCs/>
+          <w:color w:val="0B6B58"/>
+          <w:sz w:val="44"/>
+          <w:szCs w:val="44"/>
+        </w:rPr>
+      </w:r>
+    </w:p>
+    <w:p>
+      <w:pPr>
+        <w:spacing w:after="120"/>
+      </w:pPr>
+      <w:proofErr w:type="spellStart"/>
+      <w:r>
+        <w:t xml:space="preserve">ระบบรันได้ 2 แบบจากโค้ดชุดเดียวกันบน GitHub: github.com/FlyingLovey/rebooter-ai-chatbot</w:t>
+      </w:r>
+      <w:proofErr w:type="spellEnd"/>
+      <w:r/>
+      <w:proofErr w:type="spellStart"/>
+      <w:r/>
+      <w:proofErr w:type="spellEnd"/>
+      <w:r/>
+      <w:proofErr w:type="spellStart"/>
+      <w:r/>
+      <w:proofErr w:type="spellEnd"/>
+      <w:r/>
+      <w:proofErr w:type="spellStart"/>
+      <w:r/>
+      <w:proofErr w:type="spellEnd"/>
+      <w:r/>
+      <w:proofErr w:type="spellStart"/>
+      <w:r/>
+      <w:proofErr w:type="spellEnd"/>
+      <w:r/>
+      <w:proofErr w:type="spellStart"/>
+      <w:r/>
+      <w:proofErr w:type="spellEnd"/>
+    </w:p>
+    <w:p>
+      <w:pPr>
+        <w:spacing w:after="120"/>
+      </w:pPr>
+      <w:proofErr w:type="spellStart"/>
+      <w:r>
+        <w:t xml:space="preserve">บนเครื่อง (ใช้ทดสอบและบันทึกผลในหัวข้อ 5): Guard Service พอร์ต 8001 + Backend พอร์ต 8000 · embedding multilingual-e5-small รันบนเครื่อง</w:t>
+      </w:r>
+      <w:proofErr w:type="spellEnd"/>
+      <w:r/>
+      <w:proofErr w:type="spellStart"/>
+      <w:r/>
+      <w:proofErr w:type="spellEnd"/>
+      <w:r/>
+      <w:proofErr w:type="spellStart"/>
+      <w:r/>
+      <w:proofErr w:type="spellEnd"/>
+      <w:r/>
+      <w:proofErr w:type="spellStart"/>
+      <w:r/>
+      <w:proofErr w:type="spellEnd"/>
+      <w:r/>
+      <w:proofErr w:type="spellStart"/>
+      <w:r/>
+      <w:proofErr w:type="spellEnd"/>
+      <w:r/>
+      <w:proofErr w:type="spellStart"/>
+      <w:r/>
+      <w:proofErr w:type="spellEnd"/>
+    </w:p>
+    <w:p>
+      <w:pPr>
+        <w:spacing w:after="120"/>
+      </w:pPr>
+      <w:proofErr w:type="spellStart"/>
+      <w:r>
+        <w:t xml:space="preserve">ออนไลน์บน Render แผนฟรี: https://rebooter-ai.onrender.com (หน้าแรกร้าน) และ https://rebooter-ai.onrender.com/chat (หน้าแชท) · Guard Service แยกเป็นอีกบริการ · ค่าตั้งทั้งหมดอยู่ในไฟล์ render.yaml และ API key เก็บใน Environment ของ Render ไม่อยู่ในโค้ด</w:t>
+      </w:r>
+      <w:proofErr w:type="spellEnd"/>
+      <w:r/>
+      <w:proofErr w:type="spellStart"/>
+      <w:r/>
+      <w:proofErr w:type="spellEnd"/>
+      <w:r/>
+      <w:proofErr w:type="spellStart"/>
+      <w:r/>
+      <w:proofErr w:type="spellEnd"/>
+      <w:r/>
+      <w:proofErr w:type="spellStart"/>
+      <w:r/>
+      <w:proofErr w:type="spellEnd"/>
+      <w:r/>
+      <w:proofErr w:type="spellStart"/>
+      <w:r/>
+      <w:proofErr w:type="spellEnd"/>
+      <w:r/>
+      <w:proofErr w:type="spellStart"/>
+      <w:r/>
+      <w:proofErr w:type="spellEnd"/>
+    </w:p>
+    <w:p>
+      <w:pPr>
+        <w:spacing w:after="120"/>
+      </w:pPr>
+      <w:proofErr w:type="spellStart"/>
+      <w:r>
+        <w:t xml:space="preserve">เหตุที่เปลี่ยน embedding บน Render: แผนฟรีมี RAM 512 MB ไม่พอโหลด PyTorch และโมเดลบนเครื่อง จึงเรียก text-embedding-3-small ผ่าน OpenRouter แทน ระบบสร้าง index ใหม่เองเมื่อเปลี่ยนโมเดล embedding</w:t>
+      </w:r>
+      <w:proofErr w:type="spellEnd"/>
+      <w:r/>
+      <w:proofErr w:type="spellStart"/>
+      <w:r/>
+      <w:proofErr w:type="spellEnd"/>
+      <w:r/>
+      <w:proofErr w:type="spellStart"/>
+      <w:r/>
+      <w:proofErr w:type="spellEnd"/>
+      <w:r/>
+      <w:proofErr w:type="spellStart"/>
+      <w:r/>
+      <w:proofErr w:type="spellEnd"/>
+      <w:r/>
+      <w:proofErr w:type="spellStart"/>
+      <w:r/>
+      <w:proofErr w:type="spellEnd"/>
+      <w:r/>
+      <w:proofErr w:type="spellStart"/>
+      <w:r/>
+      <w:proofErr w:type="spellEnd"/>
+    </w:p>
+    <w:p>
+      <w:pPr>
+        <w:spacing w:after="120"/>
+      </w:pPr>
+      <w:proofErr w:type="spellStart"/>
+      <w:r>
+        <w:t xml:space="preserve">ข้อจำกัดของแผนฟรี: บริการหลับเมื่อว่าง 15 นาที เปิดครั้งแรกรอประมาณ 1 นาที — Backend ปลุก Guard อัตโนมัติเมื่อมีคนเปิดหน้าเว็บ และหน้าแชทแสดง “กำลังเตรียมระบบ” ระหว่างรอ · ประวัติแชทเก็บในหน่วยความจำ จึงหายเมื่อบริการหลับหรือ deploy ใหม่</w:t>
+      </w:r>
+      <w:proofErr w:type="spellEnd"/>
+      <w:r/>
+      <w:proofErr w:type="spellStart"/>
+      <w:r/>
+      <w:proofErr w:type="spellEnd"/>
+      <w:r/>
+      <w:proofErr w:type="spellStart"/>
+      <w:r/>
+      <w:proofErr w:type="spellEnd"/>
+      <w:r/>
+      <w:proofErr w:type="spellStart"/>
+      <w:r/>
+      <w:proofErr w:type="spellEnd"/>
+      <w:r/>
+      <w:proofErr w:type="spellStart"/>
+      <w:r/>
+      <w:proofErr w:type="spellEnd"/>
+      <w:r/>
+      <w:proofErr w:type="spellStart"/>
+      <w:r/>
+      <w:proofErr w:type="spellEnd"/>
+    </w:p>
+    <w:p>
+      <w:pPr>
+        <w:spacing w:after="120"/>
+      </w:pPr>
+      <w:proofErr w:type="spellStart"/>
+      <w:r>
+        <w:t xml:space="preserve">ผลทดสอบเวอร์ชันออนไลน์: [รอผลรัน eval/run_eval.py --base-url https://rebooter-ai.onrender.com]</w:t>
+      </w:r>
+      <w:proofErr w:type="spellEnd"/>
+      <w:r/>
+      <w:proofErr w:type="spellStart"/>
+      <w:r/>
+      <w:proofErr w:type="spellEnd"/>
+      <w:r/>
+      <w:proofErr w:type="spellStart"/>
+      <w:r/>
+      <w:proofErr w:type="spellEnd"/>
+      <w:r/>
+      <w:proofErr w:type="spellStart"/>
+      <w:r/>
+      <w:proofErr w:type="spellEnd"/>
+      <w:r/>
+      <w:proofErr w:type="spellStart"/>
+      <w:r/>
+      <w:proofErr w:type="spellEnd"/>
+      <w:r/>
+      <w:proofErr w:type="spellStart"/>
+      <w:r/>
+      <w:proofErr w:type="spellEnd"/>
+    </w:p>
     <w:sectPr>
       <w:footerReference w:type="default" r:id="rId21"/>
       <w:pgSz w:w="11906" w:h="16838"/>

</xml_diff>

<commit_message>
Online eval 22/22, update docs and slides
</commit_message>
<xml_diff>
--- a/docs/Rebooter_AI_Deliverable.docx
+++ b/docs/Rebooter_AI_Deliverable.docx
@@ -7620,7 +7620,7 @@
                 <w:sz w:val="28"/>
                 <w:szCs w:val="28"/>
               </w:rPr>
-              <w:t xml:space="preserve">Guard 3 ชั้น, pytest Guard 71 + Backend 22 กรณี</w:t>
+              <w:t xml:space="preserve">Guard 3 ชั้น, pytest Guard 77 + Backend 24 กรณี</w:t>
             </w:r>
             <w:proofErr w:type="spellStart"/>
             <w:r>
@@ -17188,6 +17188,13 @@
               </w:rPr>
               <w:t xml:space="preserve"> · หลังขึ้น Render พบเพิ่ม: “ขอเบอร์ของร้าน” ถูกบล็อกเป็นหมวด S7 (ข้อมูลส่วนบุคคล) ทั้งที่เป็นข้อมูลสาธารณะของร้าน</w:t>
             </w:r>
+            <w:r>
+              <w:rPr>
+                <w:sz w:val="28"/>
+                <w:szCs w:val="28"/>
+              </w:rPr>
+              <w:t xml:space="preserve"> และคำแนะนำซ่อมจอฟ้าถูกบล็อกเป็นหมวด S6 (คำแนะนำเฉพาะทาง)</w:t>
+            </w:r>
             <w:proofErr w:type="spellEnd"/>
           </w:p>
         </w:tc>
@@ -17463,6 +17470,13 @@
               </w:rPr>
               <w:t xml:space="preserve"> · เพิ่ม contact_override: หมวด S7 ผ่านได้เฉพาะเมื่อถามหรือตอบช่องทางติดต่อของร้านที่อยู่ในคลังความรู้ เบอร์อื่นหรือข้อมูลลูกค้าคนอื่นยังถูกบล็อก (unit test 8 กรณี)</w:t>
             </w:r>
+            <w:r>
+              <w:rPr>
+                <w:sz w:val="28"/>
+                <w:szCs w:val="28"/>
+              </w:rPr>
+              <w:t xml:space="preserve"> · เพิ่ม advice_override: หมวด S6 ผ่านได้เฉพาะคำแนะนำเรื่องคอม/ไอทีที่ไม่แตะการแพทย์ กฎหมาย การเงิน (unit test 6 กรณี)</w:t>
+            </w:r>
             <w:proofErr w:type="spellEnd"/>
           </w:p>
         </w:tc>
@@ -17529,6 +17543,13 @@
                 <w:szCs w:val="28"/>
               </w:rPr>
               <w:t xml:space="preserve"> · ถามเบอร์ร้านได้แล้ว</w:t>
+            </w:r>
+            <w:r>
+              <w:rPr>
+                <w:sz w:val="28"/>
+                <w:szCs w:val="28"/>
+              </w:rPr>
+              <w:t xml:space="preserve"> · ออนไลน์ 22/22</w:t>
             </w:r>
             <w:proofErr w:type="spellEnd"/>
           </w:p>
@@ -20985,7 +21006,97 @@
       </w:pPr>
       <w:proofErr w:type="spellStart"/>
       <w:r>
-        <w:t xml:space="preserve">ผลทดสอบเวอร์ชันออนไลน์: [รอผลรัน eval/run_eval.py --base-url https://rebooter-ai.onrender.com]</w:t>
+        <w:t xml:space="preserve">ผลทดสอบเวอร์ชันออนไลน์ (16 ต.ค. 2569 รันชุดเดิม 22 กรณีกับ https://rebooter-ai.onrender.com):</w:t>
+      </w:r>
+      <w:proofErr w:type="spellEnd"/>
+      <w:r/>
+      <w:proofErr w:type="spellStart"/>
+      <w:r/>
+      <w:proofErr w:type="spellEnd"/>
+      <w:r/>
+      <w:proofErr w:type="spellStart"/>
+      <w:r/>
+      <w:proofErr w:type="spellEnd"/>
+      <w:r/>
+      <w:proofErr w:type="spellStart"/>
+      <w:r/>
+      <w:proofErr w:type="spellEnd"/>
+      <w:r/>
+      <w:proofErr w:type="spellStart"/>
+      <w:r/>
+      <w:proofErr w:type="spellEnd"/>
+      <w:r/>
+      <w:proofErr w:type="spellStart"/>
+      <w:r/>
+      <w:proofErr w:type="spellEnd"/>
+    </w:p>
+    <w:p>
+      <w:pPr>
+        <w:spacing w:after="120"/>
+      </w:pPr>
+      <w:proofErr w:type="spellStart"/>
+      <w:r>
+        <w:t xml:space="preserve">รอบ 13:38 ผ่าน 21/22 — R07 “ให้ช่างรีโมทมาดูเครื่อง” ไม่ผ่าน เพราะ text-embedding-3-small จับคู่คำว่า “รีโมท” กับหัวข้อ “Remote Support ผ่าน AnyDesk” ไม่ได้ จึงดึงหัวข้อนอกขอบเขตมาแทน → แก้โดยเพิ่มบรรทัด “คำค้นที่ลูกค้ามักใช้” ใน 16 บริการ (ไม่มีราคา จึงไม่กระทบการตรวจราคา) และค้นแบบผสม: หัวข้อที่มีคำค้นตรงกับคำถามถูกดันขึ้นก่อนผลจาก embedding</w:t>
+      </w:r>
+      <w:proofErr w:type="spellEnd"/>
+      <w:r/>
+      <w:proofErr w:type="spellStart"/>
+      <w:r/>
+      <w:proofErr w:type="spellEnd"/>
+      <w:r/>
+      <w:proofErr w:type="spellStart"/>
+      <w:r/>
+      <w:proofErr w:type="spellEnd"/>
+      <w:r/>
+      <w:proofErr w:type="spellStart"/>
+      <w:r/>
+      <w:proofErr w:type="spellEnd"/>
+      <w:r/>
+      <w:proofErr w:type="spellStart"/>
+      <w:r/>
+      <w:proofErr w:type="spellEnd"/>
+      <w:r/>
+      <w:proofErr w:type="spellStart"/>
+      <w:r/>
+      <w:proofErr w:type="spellEnd"/>
+    </w:p>
+    <w:p>
+      <w:pPr>
+        <w:spacing w:after="120"/>
+      </w:pPr>
+      <w:proofErr w:type="spellStart"/>
+      <w:r>
+        <w:t xml:space="preserve">รอบ 13:50 ผ่าน 21/22 — R07 ผ่านแล้ว แต่ V01 คำตอบเรื่องจอฟ้าถูก Llama Guard บล็อกขาออกเป็นหมวด S6 (คำแนะนำเฉพาะทาง) → แก้ด้วย advice_override ตามจุดปรับปรุงที่ 1</w:t>
+      </w:r>
+      <w:proofErr w:type="spellEnd"/>
+      <w:r/>
+      <w:proofErr w:type="spellStart"/>
+      <w:r/>
+      <w:proofErr w:type="spellEnd"/>
+      <w:r/>
+      <w:proofErr w:type="spellStart"/>
+      <w:r/>
+      <w:proofErr w:type="spellEnd"/>
+      <w:r/>
+      <w:proofErr w:type="spellStart"/>
+      <w:r/>
+      <w:proofErr w:type="spellEnd"/>
+      <w:r/>
+      <w:proofErr w:type="spellStart"/>
+      <w:r/>
+      <w:proofErr w:type="spellEnd"/>
+      <w:r/>
+      <w:proofErr w:type="spellStart"/>
+      <w:r/>
+      <w:proofErr w:type="spellEnd"/>
+    </w:p>
+    <w:p>
+      <w:pPr>
+        <w:spacing w:after="120"/>
+      </w:pPr>
+      <w:proofErr w:type="spellStart"/>
+      <w:r>
+        <w:t xml:space="preserve">รอบ 14:00 ผ่าน 22/22 (คำถาม 10/10 · ภาพ 7/7 · ความปลอดภัย 5/5) · เวลาประมวลผลฝั่ง server (ค่ากลาง): คำถาม 8.4 วิ ภาพ 11.8 วิ ความปลอดภัย 0.04 วิ — ช้ากว่าบนเครื่องเพราะแผนฟรีได้ CPU เพียง 0.1 และรันทันทีหลัง deploy ใหม่ (รอบ 13:38 คำถามใช้เวลาเฉลี่ย 3.6 วิ) · ผลดิบอยู่ใน eval/results/</w:t>
       </w:r>
       <w:proofErr w:type="spellEnd"/>
       <w:r/>

</xml_diff>

<commit_message>
Final deliverable docx + PDF
</commit_message>
<xml_diff>
--- a/docs/Rebooter_AI_Deliverable.docx
+++ b/docs/Rebooter_AI_Deliverable.docx
@@ -12204,7 +12204,7 @@
     </w:p>
     <w:tbl>
       <w:tblPr>
-        <w:tblW w:w="9026" w:type="dxa"/>
+        <w:tblW w:w="10194" w:type="dxa"/>
         <w:tblBorders>
           <w:top w:val="single" w:sz="4" w:space="0" w:color="auto"/>
           <w:left w:val="single" w:sz="4" w:space="0" w:color="auto"/>
@@ -12213,6 +12213,7 @@
           <w:insideH w:val="single" w:sz="4" w:space="0" w:color="auto"/>
           <w:insideV w:val="single" w:sz="4" w:space="0" w:color="auto"/>
         </w:tblBorders>
+        <w:tblLayout w:type="fixed"/>
         <w:tblCellMar>
           <w:left w:w="10" w:type="dxa"/>
           <w:right w:w="10" w:type="dxa"/>
@@ -12220,12 +12221,12 @@
         <w:tblLook w:val="0000" w:firstRow="0" w:lastRow="0" w:firstColumn="0" w:lastColumn="0" w:noHBand="0" w:noVBand="0"/>
       </w:tblPr>
       <w:tblGrid>
-        <w:gridCol w:w="396"/>
+        <w:gridCol w:w="450"/>
         <w:gridCol w:w="1546"/>
         <w:gridCol w:w="1984"/>
-        <w:gridCol w:w="4678"/>
+        <w:gridCol w:w="4334"/>
         <w:gridCol w:w="1001"/>
-        <w:gridCol w:w="589"/>
+        <w:gridCol w:w="879"/>
       </w:tblGrid>
       <w:tr>
         <w:trPr>
@@ -12233,7 +12234,7 @@
         </w:trPr>
         <w:tc>
           <w:tcPr>
-            <w:tcW w:w="500" w:type="dxa"/>
+            <w:tcW w:w="450" w:type="dxa"/>
             <w:tcBorders>
               <w:top w:val="single" w:sz="4" w:space="0" w:color="C9CED4"/>
               <w:left w:val="single" w:sz="4" w:space="0" w:color="C9CED4"/>
@@ -12265,7 +12266,7 @@
         </w:tc>
         <w:tc>
           <w:tcPr>
-            <w:tcW w:w="1700" w:type="dxa"/>
+            <w:tcW w:w="1546" w:type="dxa"/>
             <w:tcBorders>
               <w:top w:val="single" w:sz="4" w:space="0" w:color="C9CED4"/>
               <w:left w:val="single" w:sz="4" w:space="0" w:color="C9CED4"/>
@@ -12297,7 +12298,7 @@
         </w:tc>
         <w:tc>
           <w:tcPr>
-            <w:tcW w:w="2000" w:type="dxa"/>
+            <w:tcW w:w="1984" w:type="dxa"/>
             <w:tcBorders>
               <w:top w:val="single" w:sz="4" w:space="0" w:color="C9CED4"/>
               <w:left w:val="single" w:sz="4" w:space="0" w:color="C9CED4"/>
@@ -12329,7 +12330,7 @@
         </w:tc>
         <w:tc>
           <w:tcPr>
-            <w:tcW w:w="2926" w:type="dxa"/>
+            <w:tcW w:w="4334" w:type="dxa"/>
             <w:tcBorders>
               <w:top w:val="single" w:sz="4" w:space="0" w:color="C9CED4"/>
               <w:left w:val="single" w:sz="4" w:space="0" w:color="C9CED4"/>
@@ -12383,7 +12384,7 @@
         </w:tc>
         <w:tc>
           <w:tcPr>
-            <w:tcW w:w="1000" w:type="dxa"/>
+            <w:tcW w:w="1001" w:type="dxa"/>
             <w:tcBorders>
               <w:top w:val="single" w:sz="4" w:space="0" w:color="C9CED4"/>
               <w:left w:val="single" w:sz="4" w:space="0" w:color="C9CED4"/>
@@ -12437,7 +12438,7 @@
         </w:tc>
         <w:tc>
           <w:tcPr>
-            <w:tcW w:w="900" w:type="dxa"/>
+            <w:tcW w:w="879" w:type="dxa"/>
             <w:tcBorders>
               <w:top w:val="single" w:sz="4" w:space="0" w:color="C9CED4"/>
               <w:left w:val="single" w:sz="4" w:space="0" w:color="C9CED4"/>
@@ -12506,7 +12507,7 @@
         </w:trPr>
         <w:tc>
           <w:tcPr>
-            <w:tcW w:w="500" w:type="dxa"/>
+            <w:tcW w:w="450" w:type="dxa"/>
             <w:tcBorders>
               <w:top w:val="single" w:sz="4" w:space="0" w:color="C9CED4"/>
               <w:left w:val="single" w:sz="4" w:space="0" w:color="C9CED4"/>
@@ -12535,7 +12536,7 @@
         </w:tc>
         <w:tc>
           <w:tcPr>
-            <w:tcW w:w="1700" w:type="dxa"/>
+            <w:tcW w:w="1546" w:type="dxa"/>
             <w:tcBorders>
               <w:top w:val="single" w:sz="4" w:space="0" w:color="C9CED4"/>
               <w:left w:val="single" w:sz="4" w:space="0" w:color="C9CED4"/>
@@ -12615,7 +12616,7 @@
         </w:tc>
         <w:tc>
           <w:tcPr>
-            <w:tcW w:w="2000" w:type="dxa"/>
+            <w:tcW w:w="1984" w:type="dxa"/>
             <w:tcBorders>
               <w:top w:val="single" w:sz="4" w:space="0" w:color="C9CED4"/>
               <w:left w:val="single" w:sz="4" w:space="0" w:color="C9CED4"/>
@@ -12675,7 +12676,7 @@
         </w:tc>
         <w:tc>
           <w:tcPr>
-            <w:tcW w:w="2926" w:type="dxa"/>
+            <w:tcW w:w="4334" w:type="dxa"/>
             <w:tcBorders>
               <w:top w:val="single" w:sz="4" w:space="0" w:color="C9CED4"/>
               <w:left w:val="single" w:sz="4" w:space="0" w:color="C9CED4"/>
@@ -12823,7 +12824,7 @@
         </w:tc>
         <w:tc>
           <w:tcPr>
-            <w:tcW w:w="1000" w:type="dxa"/>
+            <w:tcW w:w="1001" w:type="dxa"/>
             <w:tcBorders>
               <w:top w:val="single" w:sz="4" w:space="0" w:color="C9CED4"/>
               <w:left w:val="single" w:sz="4" w:space="0" w:color="C9CED4"/>
@@ -12854,7 +12855,7 @@
         </w:tc>
         <w:tc>
           <w:tcPr>
-            <w:tcW w:w="900" w:type="dxa"/>
+            <w:tcW w:w="879" w:type="dxa"/>
             <w:tcBorders>
               <w:top w:val="single" w:sz="4" w:space="0" w:color="C9CED4"/>
               <w:left w:val="single" w:sz="4" w:space="0" w:color="C9CED4"/>
@@ -12888,7 +12889,7 @@
         </w:trPr>
         <w:tc>
           <w:tcPr>
-            <w:tcW w:w="500" w:type="dxa"/>
+            <w:tcW w:w="450" w:type="dxa"/>
             <w:tcBorders>
               <w:top w:val="single" w:sz="4" w:space="0" w:color="C9CED4"/>
               <w:left w:val="single" w:sz="4" w:space="0" w:color="C9CED4"/>
@@ -12917,7 +12918,7 @@
         </w:tc>
         <w:tc>
           <w:tcPr>
-            <w:tcW w:w="1700" w:type="dxa"/>
+            <w:tcW w:w="1546" w:type="dxa"/>
             <w:tcBorders>
               <w:top w:val="single" w:sz="4" w:space="0" w:color="C9CED4"/>
               <w:left w:val="single" w:sz="4" w:space="0" w:color="C9CED4"/>
@@ -12988,7 +12989,7 @@
         </w:tc>
         <w:tc>
           <w:tcPr>
-            <w:tcW w:w="2000" w:type="dxa"/>
+            <w:tcW w:w="1984" w:type="dxa"/>
             <w:tcBorders>
               <w:top w:val="single" w:sz="4" w:space="0" w:color="C9CED4"/>
               <w:left w:val="single" w:sz="4" w:space="0" w:color="C9CED4"/>
@@ -13087,7 +13088,7 @@
         </w:tc>
         <w:tc>
           <w:tcPr>
-            <w:tcW w:w="2926" w:type="dxa"/>
+            <w:tcW w:w="4334" w:type="dxa"/>
             <w:tcBorders>
               <w:top w:val="single" w:sz="4" w:space="0" w:color="C9CED4"/>
               <w:left w:val="single" w:sz="4" w:space="0" w:color="C9CED4"/>
@@ -13228,7 +13229,7 @@
         </w:tc>
         <w:tc>
           <w:tcPr>
-            <w:tcW w:w="1000" w:type="dxa"/>
+            <w:tcW w:w="1001" w:type="dxa"/>
             <w:tcBorders>
               <w:top w:val="single" w:sz="4" w:space="0" w:color="C9CED4"/>
               <w:left w:val="single" w:sz="4" w:space="0" w:color="C9CED4"/>
@@ -13259,7 +13260,7 @@
         </w:tc>
         <w:tc>
           <w:tcPr>
-            <w:tcW w:w="900" w:type="dxa"/>
+            <w:tcW w:w="879" w:type="dxa"/>
             <w:tcBorders>
               <w:top w:val="single" w:sz="4" w:space="0" w:color="C9CED4"/>
               <w:left w:val="single" w:sz="4" w:space="0" w:color="C9CED4"/>
@@ -13293,7 +13294,7 @@
         </w:trPr>
         <w:tc>
           <w:tcPr>
-            <w:tcW w:w="500" w:type="dxa"/>
+            <w:tcW w:w="450" w:type="dxa"/>
             <w:tcBorders>
               <w:top w:val="single" w:sz="4" w:space="0" w:color="C9CED4"/>
               <w:left w:val="single" w:sz="4" w:space="0" w:color="C9CED4"/>
@@ -13322,7 +13323,7 @@
         </w:tc>
         <w:tc>
           <w:tcPr>
-            <w:tcW w:w="1700" w:type="dxa"/>
+            <w:tcW w:w="1546" w:type="dxa"/>
             <w:tcBorders>
               <w:top w:val="single" w:sz="4" w:space="0" w:color="C9CED4"/>
               <w:left w:val="single" w:sz="4" w:space="0" w:color="C9CED4"/>
@@ -13395,7 +13396,7 @@
         </w:tc>
         <w:tc>
           <w:tcPr>
-            <w:tcW w:w="2000" w:type="dxa"/>
+            <w:tcW w:w="1984" w:type="dxa"/>
             <w:tcBorders>
               <w:top w:val="single" w:sz="4" w:space="0" w:color="C9CED4"/>
               <w:left w:val="single" w:sz="4" w:space="0" w:color="C9CED4"/>
@@ -13487,7 +13488,7 @@
         </w:tc>
         <w:tc>
           <w:tcPr>
-            <w:tcW w:w="2926" w:type="dxa"/>
+            <w:tcW w:w="4334" w:type="dxa"/>
             <w:tcBorders>
               <w:top w:val="single" w:sz="4" w:space="0" w:color="C9CED4"/>
               <w:left w:val="single" w:sz="4" w:space="0" w:color="C9CED4"/>
@@ -13628,7 +13629,7 @@
         </w:tc>
         <w:tc>
           <w:tcPr>
-            <w:tcW w:w="1000" w:type="dxa"/>
+            <w:tcW w:w="1001" w:type="dxa"/>
             <w:tcBorders>
               <w:top w:val="single" w:sz="4" w:space="0" w:color="C9CED4"/>
               <w:left w:val="single" w:sz="4" w:space="0" w:color="C9CED4"/>
@@ -13659,7 +13660,7 @@
         </w:tc>
         <w:tc>
           <w:tcPr>
-            <w:tcW w:w="900" w:type="dxa"/>
+            <w:tcW w:w="879" w:type="dxa"/>
             <w:tcBorders>
               <w:top w:val="single" w:sz="4" w:space="0" w:color="C9CED4"/>
               <w:left w:val="single" w:sz="4" w:space="0" w:color="C9CED4"/>
@@ -13693,7 +13694,7 @@
         </w:trPr>
         <w:tc>
           <w:tcPr>
-            <w:tcW w:w="500" w:type="dxa"/>
+            <w:tcW w:w="450" w:type="dxa"/>
             <w:tcBorders>
               <w:top w:val="single" w:sz="4" w:space="0" w:color="C9CED4"/>
               <w:left w:val="single" w:sz="4" w:space="0" w:color="C9CED4"/>
@@ -13722,7 +13723,7 @@
         </w:tc>
         <w:tc>
           <w:tcPr>
-            <w:tcW w:w="1700" w:type="dxa"/>
+            <w:tcW w:w="1546" w:type="dxa"/>
             <w:tcBorders>
               <w:top w:val="single" w:sz="4" w:space="0" w:color="C9CED4"/>
               <w:left w:val="single" w:sz="4" w:space="0" w:color="C9CED4"/>
@@ -13795,7 +13796,7 @@
         </w:tc>
         <w:tc>
           <w:tcPr>
-            <w:tcW w:w="2000" w:type="dxa"/>
+            <w:tcW w:w="1984" w:type="dxa"/>
             <w:tcBorders>
               <w:top w:val="single" w:sz="4" w:space="0" w:color="C9CED4"/>
               <w:left w:val="single" w:sz="4" w:space="0" w:color="C9CED4"/>
@@ -13871,7 +13872,7 @@
         </w:tc>
         <w:tc>
           <w:tcPr>
-            <w:tcW w:w="2926" w:type="dxa"/>
+            <w:tcW w:w="4334" w:type="dxa"/>
             <w:tcBorders>
               <w:top w:val="single" w:sz="4" w:space="0" w:color="C9CED4"/>
               <w:left w:val="single" w:sz="4" w:space="0" w:color="C9CED4"/>
@@ -14053,7 +14054,7 @@
         </w:tc>
         <w:tc>
           <w:tcPr>
-            <w:tcW w:w="1000" w:type="dxa"/>
+            <w:tcW w:w="1001" w:type="dxa"/>
             <w:tcBorders>
               <w:top w:val="single" w:sz="4" w:space="0" w:color="C9CED4"/>
               <w:left w:val="single" w:sz="4" w:space="0" w:color="C9CED4"/>
@@ -14084,7 +14085,7 @@
         </w:tc>
         <w:tc>
           <w:tcPr>
-            <w:tcW w:w="900" w:type="dxa"/>
+            <w:tcW w:w="879" w:type="dxa"/>
             <w:tcBorders>
               <w:top w:val="single" w:sz="4" w:space="0" w:color="C9CED4"/>
               <w:left w:val="single" w:sz="4" w:space="0" w:color="C9CED4"/>
@@ -14118,7 +14119,7 @@
         </w:trPr>
         <w:tc>
           <w:tcPr>
-            <w:tcW w:w="500" w:type="dxa"/>
+            <w:tcW w:w="450" w:type="dxa"/>
             <w:tcBorders>
               <w:top w:val="single" w:sz="4" w:space="0" w:color="C9CED4"/>
               <w:left w:val="single" w:sz="4" w:space="0" w:color="C9CED4"/>
@@ -14147,7 +14148,7 @@
         </w:tc>
         <w:tc>
           <w:tcPr>
-            <w:tcW w:w="1700" w:type="dxa"/>
+            <w:tcW w:w="1546" w:type="dxa"/>
             <w:tcBorders>
               <w:top w:val="single" w:sz="4" w:space="0" w:color="C9CED4"/>
               <w:left w:val="single" w:sz="4" w:space="0" w:color="C9CED4"/>
@@ -14243,7 +14244,7 @@
         </w:tc>
         <w:tc>
           <w:tcPr>
-            <w:tcW w:w="2000" w:type="dxa"/>
+            <w:tcW w:w="1984" w:type="dxa"/>
             <w:tcBorders>
               <w:top w:val="single" w:sz="4" w:space="0" w:color="C9CED4"/>
               <w:left w:val="single" w:sz="4" w:space="0" w:color="C9CED4"/>
@@ -14319,7 +14320,7 @@
         </w:tc>
         <w:tc>
           <w:tcPr>
-            <w:tcW w:w="2926" w:type="dxa"/>
+            <w:tcW w:w="4334" w:type="dxa"/>
             <w:tcBorders>
               <w:top w:val="single" w:sz="4" w:space="0" w:color="C9CED4"/>
               <w:left w:val="single" w:sz="4" w:space="0" w:color="C9CED4"/>
@@ -14460,7 +14461,7 @@
         </w:tc>
         <w:tc>
           <w:tcPr>
-            <w:tcW w:w="1000" w:type="dxa"/>
+            <w:tcW w:w="1001" w:type="dxa"/>
             <w:tcBorders>
               <w:top w:val="single" w:sz="4" w:space="0" w:color="C9CED4"/>
               <w:left w:val="single" w:sz="4" w:space="0" w:color="C9CED4"/>
@@ -14491,7 +14492,7 @@
         </w:tc>
         <w:tc>
           <w:tcPr>
-            <w:tcW w:w="900" w:type="dxa"/>
+            <w:tcW w:w="879" w:type="dxa"/>
             <w:tcBorders>
               <w:top w:val="single" w:sz="4" w:space="0" w:color="C9CED4"/>
               <w:left w:val="single" w:sz="4" w:space="0" w:color="C9CED4"/>
@@ -14904,7 +14905,7 @@
     </w:p>
     <w:tbl>
       <w:tblPr>
-        <w:tblW w:w="9026" w:type="dxa"/>
+        <w:tblW w:w="10194" w:type="dxa"/>
         <w:tblBorders>
           <w:top w:val="single" w:sz="4" w:space="0" w:color="auto"/>
           <w:left w:val="single" w:sz="4" w:space="0" w:color="auto"/>
@@ -14913,6 +14914,7 @@
           <w:insideH w:val="single" w:sz="4" w:space="0" w:color="auto"/>
           <w:insideV w:val="single" w:sz="4" w:space="0" w:color="auto"/>
         </w:tblBorders>
+        <w:tblLayout w:type="fixed"/>
         <w:tblCellMar>
           <w:left w:w="10" w:type="dxa"/>
           <w:right w:w="10" w:type="dxa"/>
@@ -14920,13 +14922,13 @@
         <w:tblLook w:val="0000" w:firstRow="0" w:lastRow="0" w:firstColumn="0" w:lastColumn="0" w:noHBand="0" w:noVBand="0"/>
       </w:tblPr>
       <w:tblGrid>
-        <w:gridCol w:w="349"/>
+        <w:gridCol w:w="450"/>
         <w:gridCol w:w="1198"/>
-        <w:gridCol w:w="2112"/>
-        <w:gridCol w:w="1015"/>
-        <w:gridCol w:w="4263"/>
+        <w:gridCol w:w="1900"/>
+        <w:gridCol w:w="1500"/>
+        <w:gridCol w:w="3584"/>
         <w:gridCol w:w="812"/>
-        <w:gridCol w:w="445"/>
+        <w:gridCol w:w="750"/>
       </w:tblGrid>
       <w:tr>
         <w:trPr>
@@ -14934,7 +14936,7 @@
         </w:trPr>
         <w:tc>
           <w:tcPr>
-            <w:tcW w:w="500" w:type="dxa"/>
+            <w:tcW w:w="450" w:type="dxa"/>
             <w:tcBorders>
               <w:top w:val="single" w:sz="4" w:space="0" w:color="C9CED4"/>
               <w:left w:val="single" w:sz="4" w:space="0" w:color="C9CED4"/>
@@ -14966,7 +14968,7 @@
         </w:tc>
         <w:tc>
           <w:tcPr>
-            <w:tcW w:w="1300" w:type="dxa"/>
+            <w:tcW w:w="1198" w:type="dxa"/>
             <w:tcBorders>
               <w:top w:val="single" w:sz="4" w:space="0" w:color="C9CED4"/>
               <w:left w:val="single" w:sz="4" w:space="0" w:color="C9CED4"/>
@@ -15030,7 +15032,7 @@
         </w:tc>
         <w:tc>
           <w:tcPr>
-            <w:tcW w:w="1700" w:type="dxa"/>
+            <w:tcW w:w="1500" w:type="dxa"/>
             <w:tcBorders>
               <w:top w:val="single" w:sz="4" w:space="0" w:color="C9CED4"/>
               <w:left w:val="single" w:sz="4" w:space="0" w:color="C9CED4"/>
@@ -15062,7 +15064,7 @@
         </w:tc>
         <w:tc>
           <w:tcPr>
-            <w:tcW w:w="1926" w:type="dxa"/>
+            <w:tcW w:w="3584" w:type="dxa"/>
             <w:tcBorders>
               <w:top w:val="single" w:sz="4" w:space="0" w:color="C9CED4"/>
               <w:left w:val="single" w:sz="4" w:space="0" w:color="C9CED4"/>
@@ -15094,7 +15096,7 @@
         </w:tc>
         <w:tc>
           <w:tcPr>
-            <w:tcW w:w="900" w:type="dxa"/>
+            <w:tcW w:w="812" w:type="dxa"/>
             <w:tcBorders>
               <w:top w:val="single" w:sz="4" w:space="0" w:color="C9CED4"/>
               <w:left w:val="single" w:sz="4" w:space="0" w:color="C9CED4"/>
@@ -15148,7 +15150,7 @@
         </w:tc>
         <w:tc>
           <w:tcPr>
-            <w:tcW w:w="800" w:type="dxa"/>
+            <w:tcW w:w="750" w:type="dxa"/>
             <w:tcBorders>
               <w:top w:val="single" w:sz="4" w:space="0" w:color="C9CED4"/>
               <w:left w:val="single" w:sz="4" w:space="0" w:color="C9CED4"/>
@@ -15217,7 +15219,7 @@
         </w:trPr>
         <w:tc>
           <w:tcPr>
-            <w:tcW w:w="500" w:type="dxa"/>
+            <w:tcW w:w="450" w:type="dxa"/>
             <w:tcBorders>
               <w:top w:val="single" w:sz="4" w:space="0" w:color="C9CED4"/>
               <w:left w:val="single" w:sz="4" w:space="0" w:color="C9CED4"/>
@@ -15246,7 +15248,7 @@
         </w:tc>
         <w:tc>
           <w:tcPr>
-            <w:tcW w:w="1300" w:type="dxa"/>
+            <w:tcW w:w="1198" w:type="dxa"/>
             <w:tcBorders>
               <w:top w:val="single" w:sz="4" w:space="0" w:color="C9CED4"/>
               <w:left w:val="single" w:sz="4" w:space="0" w:color="C9CED4"/>
@@ -15334,7 +15336,7 @@
         </w:tc>
         <w:tc>
           <w:tcPr>
-            <w:tcW w:w="1700" w:type="dxa"/>
+            <w:tcW w:w="1500" w:type="dxa"/>
             <w:tcBorders>
               <w:top w:val="single" w:sz="4" w:space="0" w:color="C9CED4"/>
               <w:left w:val="single" w:sz="4" w:space="0" w:color="C9CED4"/>
@@ -15360,7 +15362,7 @@
         </w:tc>
         <w:tc>
           <w:tcPr>
-            <w:tcW w:w="1926" w:type="dxa"/>
+            <w:tcW w:w="3584" w:type="dxa"/>
             <w:tcBorders>
               <w:top w:val="single" w:sz="4" w:space="0" w:color="C9CED4"/>
               <w:left w:val="single" w:sz="4" w:space="0" w:color="C9CED4"/>
@@ -15443,7 +15445,7 @@
         </w:tc>
         <w:tc>
           <w:tcPr>
-            <w:tcW w:w="900" w:type="dxa"/>
+            <w:tcW w:w="812" w:type="dxa"/>
             <w:tcBorders>
               <w:top w:val="single" w:sz="4" w:space="0" w:color="C9CED4"/>
               <w:left w:val="single" w:sz="4" w:space="0" w:color="C9CED4"/>
@@ -15474,7 +15476,7 @@
         </w:tc>
         <w:tc>
           <w:tcPr>
-            <w:tcW w:w="800" w:type="dxa"/>
+            <w:tcW w:w="750" w:type="dxa"/>
             <w:tcBorders>
               <w:top w:val="single" w:sz="4" w:space="0" w:color="C9CED4"/>
               <w:left w:val="single" w:sz="4" w:space="0" w:color="C9CED4"/>
@@ -15508,7 +15510,7 @@
         </w:trPr>
         <w:tc>
           <w:tcPr>
-            <w:tcW w:w="500" w:type="dxa"/>
+            <w:tcW w:w="450" w:type="dxa"/>
             <w:tcBorders>
               <w:top w:val="single" w:sz="4" w:space="0" w:color="C9CED4"/>
               <w:left w:val="single" w:sz="4" w:space="0" w:color="C9CED4"/>
@@ -15537,7 +15539,7 @@
         </w:tc>
         <w:tc>
           <w:tcPr>
-            <w:tcW w:w="1300" w:type="dxa"/>
+            <w:tcW w:w="1198" w:type="dxa"/>
             <w:tcBorders>
               <w:top w:val="single" w:sz="4" w:space="0" w:color="C9CED4"/>
               <w:left w:val="single" w:sz="4" w:space="0" w:color="C9CED4"/>
@@ -15593,7 +15595,7 @@
         </w:tc>
         <w:tc>
           <w:tcPr>
-            <w:tcW w:w="1700" w:type="dxa"/>
+            <w:tcW w:w="1500" w:type="dxa"/>
             <w:tcBorders>
               <w:top w:val="single" w:sz="4" w:space="0" w:color="C9CED4"/>
               <w:left w:val="single" w:sz="4" w:space="0" w:color="C9CED4"/>
@@ -15619,7 +15621,7 @@
         </w:tc>
         <w:tc>
           <w:tcPr>
-            <w:tcW w:w="1926" w:type="dxa"/>
+            <w:tcW w:w="3584" w:type="dxa"/>
             <w:tcBorders>
               <w:top w:val="single" w:sz="4" w:space="0" w:color="C9CED4"/>
               <w:left w:val="single" w:sz="4" w:space="0" w:color="C9CED4"/>
@@ -15663,7 +15665,7 @@
         </w:tc>
         <w:tc>
           <w:tcPr>
-            <w:tcW w:w="900" w:type="dxa"/>
+            <w:tcW w:w="812" w:type="dxa"/>
             <w:tcBorders>
               <w:top w:val="single" w:sz="4" w:space="0" w:color="C9CED4"/>
               <w:left w:val="single" w:sz="4" w:space="0" w:color="C9CED4"/>
@@ -15694,7 +15696,7 @@
         </w:tc>
         <w:tc>
           <w:tcPr>
-            <w:tcW w:w="800" w:type="dxa"/>
+            <w:tcW w:w="750" w:type="dxa"/>
             <w:tcBorders>
               <w:top w:val="single" w:sz="4" w:space="0" w:color="C9CED4"/>
               <w:left w:val="single" w:sz="4" w:space="0" w:color="C9CED4"/>
@@ -15728,7 +15730,7 @@
         </w:trPr>
         <w:tc>
           <w:tcPr>
-            <w:tcW w:w="500" w:type="dxa"/>
+            <w:tcW w:w="450" w:type="dxa"/>
             <w:tcBorders>
               <w:top w:val="single" w:sz="4" w:space="0" w:color="C9CED4"/>
               <w:left w:val="single" w:sz="4" w:space="0" w:color="C9CED4"/>
@@ -15758,7 +15760,7 @@
         </w:tc>
         <w:tc>
           <w:tcPr>
-            <w:tcW w:w="1300" w:type="dxa"/>
+            <w:tcW w:w="1198" w:type="dxa"/>
             <w:tcBorders>
               <w:top w:val="single" w:sz="4" w:space="0" w:color="C9CED4"/>
               <w:left w:val="single" w:sz="4" w:space="0" w:color="C9CED4"/>
@@ -15814,7 +15816,7 @@
         </w:tc>
         <w:tc>
           <w:tcPr>
-            <w:tcW w:w="1700" w:type="dxa"/>
+            <w:tcW w:w="1500" w:type="dxa"/>
             <w:tcBorders>
               <w:top w:val="single" w:sz="4" w:space="0" w:color="C9CED4"/>
               <w:left w:val="single" w:sz="4" w:space="0" w:color="C9CED4"/>
@@ -15840,7 +15842,7 @@
         </w:tc>
         <w:tc>
           <w:tcPr>
-            <w:tcW w:w="1926" w:type="dxa"/>
+            <w:tcW w:w="3584" w:type="dxa"/>
             <w:tcBorders>
               <w:top w:val="single" w:sz="4" w:space="0" w:color="C9CED4"/>
               <w:left w:val="single" w:sz="4" w:space="0" w:color="C9CED4"/>
@@ -15923,7 +15925,7 @@
         </w:tc>
         <w:tc>
           <w:tcPr>
-            <w:tcW w:w="900" w:type="dxa"/>
+            <w:tcW w:w="812" w:type="dxa"/>
             <w:tcBorders>
               <w:top w:val="single" w:sz="4" w:space="0" w:color="C9CED4"/>
               <w:left w:val="single" w:sz="4" w:space="0" w:color="C9CED4"/>
@@ -15954,7 +15956,7 @@
         </w:tc>
         <w:tc>
           <w:tcPr>
-            <w:tcW w:w="800" w:type="dxa"/>
+            <w:tcW w:w="750" w:type="dxa"/>
             <w:tcBorders>
               <w:top w:val="single" w:sz="4" w:space="0" w:color="C9CED4"/>
               <w:left w:val="single" w:sz="4" w:space="0" w:color="C9CED4"/>
@@ -15988,7 +15990,7 @@
         </w:trPr>
         <w:tc>
           <w:tcPr>
-            <w:tcW w:w="500" w:type="dxa"/>
+            <w:tcW w:w="450" w:type="dxa"/>
             <w:tcBorders>
               <w:top w:val="single" w:sz="4" w:space="0" w:color="C9CED4"/>
               <w:left w:val="single" w:sz="4" w:space="0" w:color="C9CED4"/>
@@ -16017,7 +16019,7 @@
         </w:tc>
         <w:tc>
           <w:tcPr>
-            <w:tcW w:w="1300" w:type="dxa"/>
+            <w:tcW w:w="1198" w:type="dxa"/>
             <w:tcBorders>
               <w:top w:val="single" w:sz="4" w:space="0" w:color="C9CED4"/>
               <w:left w:val="single" w:sz="4" w:space="0" w:color="C9CED4"/>
@@ -16089,7 +16091,7 @@
         </w:tc>
         <w:tc>
           <w:tcPr>
-            <w:tcW w:w="1700" w:type="dxa"/>
+            <w:tcW w:w="1500" w:type="dxa"/>
             <w:tcBorders>
               <w:top w:val="single" w:sz="4" w:space="0" w:color="C9CED4"/>
               <w:left w:val="single" w:sz="4" w:space="0" w:color="C9CED4"/>
@@ -16115,7 +16117,7 @@
         </w:tc>
         <w:tc>
           <w:tcPr>
-            <w:tcW w:w="1926" w:type="dxa"/>
+            <w:tcW w:w="3584" w:type="dxa"/>
             <w:tcBorders>
               <w:top w:val="single" w:sz="4" w:space="0" w:color="C9CED4"/>
               <w:left w:val="single" w:sz="4" w:space="0" w:color="C9CED4"/>
@@ -16182,7 +16184,7 @@
         </w:tc>
         <w:tc>
           <w:tcPr>
-            <w:tcW w:w="900" w:type="dxa"/>
+            <w:tcW w:w="812" w:type="dxa"/>
             <w:tcBorders>
               <w:top w:val="single" w:sz="4" w:space="0" w:color="C9CED4"/>
               <w:left w:val="single" w:sz="4" w:space="0" w:color="C9CED4"/>
@@ -16213,7 +16215,7 @@
         </w:tc>
         <w:tc>
           <w:tcPr>
-            <w:tcW w:w="800" w:type="dxa"/>
+            <w:tcW w:w="750" w:type="dxa"/>
             <w:tcBorders>
               <w:top w:val="single" w:sz="4" w:space="0" w:color="C9CED4"/>
               <w:left w:val="single" w:sz="4" w:space="0" w:color="C9CED4"/>
@@ -16247,7 +16249,7 @@
         </w:trPr>
         <w:tc>
           <w:tcPr>
-            <w:tcW w:w="500" w:type="dxa"/>
+            <w:tcW w:w="450" w:type="dxa"/>
             <w:tcBorders>
               <w:top w:val="single" w:sz="4" w:space="0" w:color="C9CED4"/>
               <w:left w:val="single" w:sz="4" w:space="0" w:color="C9CED4"/>
@@ -16276,7 +16278,7 @@
         </w:tc>
         <w:tc>
           <w:tcPr>
-            <w:tcW w:w="1300" w:type="dxa"/>
+            <w:tcW w:w="1198" w:type="dxa"/>
             <w:tcBorders>
               <w:top w:val="single" w:sz="4" w:space="0" w:color="C9CED4"/>
               <w:left w:val="single" w:sz="4" w:space="0" w:color="C9CED4"/>
@@ -16348,7 +16350,7 @@
         </w:tc>
         <w:tc>
           <w:tcPr>
-            <w:tcW w:w="1700" w:type="dxa"/>
+            <w:tcW w:w="1500" w:type="dxa"/>
             <w:tcBorders>
               <w:top w:val="single" w:sz="4" w:space="0" w:color="C9CED4"/>
               <w:left w:val="single" w:sz="4" w:space="0" w:color="C9CED4"/>
@@ -16374,7 +16376,7 @@
         </w:tc>
         <w:tc>
           <w:tcPr>
-            <w:tcW w:w="1926" w:type="dxa"/>
+            <w:tcW w:w="3584" w:type="dxa"/>
             <w:tcBorders>
               <w:top w:val="single" w:sz="4" w:space="0" w:color="C9CED4"/>
               <w:left w:val="single" w:sz="4" w:space="0" w:color="C9CED4"/>
@@ -16425,7 +16427,7 @@
         </w:tc>
         <w:tc>
           <w:tcPr>
-            <w:tcW w:w="900" w:type="dxa"/>
+            <w:tcW w:w="812" w:type="dxa"/>
             <w:tcBorders>
               <w:top w:val="single" w:sz="4" w:space="0" w:color="C9CED4"/>
               <w:left w:val="single" w:sz="4" w:space="0" w:color="C9CED4"/>
@@ -16456,7 +16458,7 @@
         </w:tc>
         <w:tc>
           <w:tcPr>
-            <w:tcW w:w="800" w:type="dxa"/>
+            <w:tcW w:w="750" w:type="dxa"/>
             <w:tcBorders>
               <w:top w:val="single" w:sz="4" w:space="0" w:color="C9CED4"/>
               <w:left w:val="single" w:sz="4" w:space="0" w:color="C9CED4"/>
@@ -16726,6 +16728,7 @@
       <w:pPr>
         <w:pStyle w:val="Heading2"/>
         <w:keepNext/>
+        <w:pageBreakBefore/>
         <w:spacing w:before="240" w:after="120"/>
       </w:pPr>
       <w:r>
@@ -16769,9 +16772,212 @@
       </w:r>
       <w:proofErr w:type="spellEnd"/>
     </w:p>
+    <w:p>
+      <w:pPr>
+        <w:spacing w:after="160"/>
+      </w:pPr>
+      <w:proofErr w:type="spellStart"/>
+      <w:r>
+        <w:rPr>
+          <w:i/>
+          <w:iCs/>
+          <w:color w:val="555555"/>
+          <w:sz w:val="28"/>
+          <w:szCs w:val="28"/>
+        </w:rPr>
+        <w:t>ผลรอบแรก</w:t>
+      </w:r>
+      <w:proofErr w:type="spellEnd"/>
+      <w:r>
+        <w:rPr>
+          <w:i/>
+          <w:iCs/>
+          <w:color w:val="555555"/>
+          <w:sz w:val="28"/>
+          <w:szCs w:val="28"/>
+        </w:rPr>
+        <w:t xml:space="preserve"> (06:34 น. </w:t>
+      </w:r>
+      <w:proofErr w:type="spellStart"/>
+      <w:r>
+        <w:rPr>
+          <w:i/>
+          <w:iCs/>
+          <w:color w:val="555555"/>
+          <w:sz w:val="28"/>
+          <w:szCs w:val="28"/>
+        </w:rPr>
+        <w:t>ก่อนแก้จุดที่</w:t>
+      </w:r>
+      <w:proofErr w:type="spellEnd"/>
+      <w:r>
+        <w:rPr>
+          <w:i/>
+          <w:iCs/>
+          <w:color w:val="555555"/>
+          <w:sz w:val="28"/>
+          <w:szCs w:val="28"/>
+        </w:rPr>
+        <w:t xml:space="preserve"> 1): </w:t>
+      </w:r>
+      <w:proofErr w:type="spellStart"/>
+      <w:r>
+        <w:rPr>
+          <w:i/>
+          <w:iCs/>
+          <w:color w:val="555555"/>
+          <w:sz w:val="28"/>
+          <w:szCs w:val="28"/>
+        </w:rPr>
+        <w:t>คำถาม</w:t>
+      </w:r>
+      <w:proofErr w:type="spellEnd"/>
+      <w:r>
+        <w:rPr>
+          <w:i/>
+          <w:iCs/>
+          <w:color w:val="555555"/>
+          <w:sz w:val="28"/>
+          <w:szCs w:val="28"/>
+        </w:rPr>
+        <w:t xml:space="preserve"> 9/10 · </w:t>
+      </w:r>
+      <w:proofErr w:type="spellStart"/>
+      <w:r>
+        <w:rPr>
+          <w:i/>
+          <w:iCs/>
+          <w:color w:val="555555"/>
+          <w:sz w:val="28"/>
+          <w:szCs w:val="28"/>
+        </w:rPr>
+        <w:t>ภาพ</w:t>
+      </w:r>
+      <w:proofErr w:type="spellEnd"/>
+      <w:r>
+        <w:rPr>
+          <w:i/>
+          <w:iCs/>
+          <w:color w:val="555555"/>
+          <w:sz w:val="28"/>
+          <w:szCs w:val="28"/>
+        </w:rPr>
+        <w:t xml:space="preserve"> 6/7 · </w:t>
+      </w:r>
+      <w:proofErr w:type="spellStart"/>
+      <w:r>
+        <w:rPr>
+          <w:i/>
+          <w:iCs/>
+          <w:color w:val="555555"/>
+          <w:sz w:val="28"/>
+          <w:szCs w:val="28"/>
+        </w:rPr>
+        <w:t>ความปลอดภัย</w:t>
+      </w:r>
+      <w:proofErr w:type="spellEnd"/>
+      <w:r>
+        <w:rPr>
+          <w:i/>
+          <w:iCs/>
+          <w:color w:val="555555"/>
+          <w:sz w:val="28"/>
+          <w:szCs w:val="28"/>
+        </w:rPr>
+        <w:t xml:space="preserve"> 5/5 — </w:t>
+      </w:r>
+      <w:proofErr w:type="spellStart"/>
+      <w:r>
+        <w:rPr>
+          <w:i/>
+          <w:iCs/>
+          <w:color w:val="555555"/>
+          <w:sz w:val="28"/>
+          <w:szCs w:val="28"/>
+        </w:rPr>
+        <w:t>ข้อที่ไม่ผ่านคือ</w:t>
+      </w:r>
+      <w:proofErr w:type="spellEnd"/>
+      <w:r>
+        <w:rPr>
+          <w:i/>
+          <w:iCs/>
+          <w:color w:val="555555"/>
+          <w:sz w:val="28"/>
+          <w:szCs w:val="28"/>
+        </w:rPr>
+        <w:t xml:space="preserve"> R05 </w:t>
+      </w:r>
+      <w:proofErr w:type="spellStart"/>
+      <w:r>
+        <w:rPr>
+          <w:i/>
+          <w:iCs/>
+          <w:color w:val="555555"/>
+          <w:sz w:val="28"/>
+          <w:szCs w:val="28"/>
+        </w:rPr>
+        <w:t>และ</w:t>
+      </w:r>
+      <w:proofErr w:type="spellEnd"/>
+      <w:r>
+        <w:rPr>
+          <w:i/>
+          <w:iCs/>
+          <w:color w:val="555555"/>
+          <w:sz w:val="28"/>
+          <w:szCs w:val="28"/>
+        </w:rPr>
+        <w:t xml:space="preserve"> V07 </w:t>
+      </w:r>
+      <w:proofErr w:type="spellStart"/>
+      <w:r>
+        <w:rPr>
+          <w:i/>
+          <w:iCs/>
+          <w:color w:val="555555"/>
+          <w:sz w:val="28"/>
+          <w:szCs w:val="28"/>
+        </w:rPr>
+        <w:t>ซึ่ง</w:t>
+      </w:r>
+      <w:proofErr w:type="spellEnd"/>
+      <w:r>
+        <w:rPr>
+          <w:i/>
+          <w:iCs/>
+          <w:color w:val="555555"/>
+          <w:sz w:val="28"/>
+          <w:szCs w:val="28"/>
+        </w:rPr>
+        <w:t xml:space="preserve"> Llama Guard </w:t>
+      </w:r>
+      <w:proofErr w:type="spellStart"/>
+      <w:r>
+        <w:rPr>
+          <w:i/>
+          <w:iCs/>
+          <w:color w:val="555555"/>
+          <w:sz w:val="28"/>
+          <w:szCs w:val="28"/>
+        </w:rPr>
+        <w:t>บล็อกผิดเป็นหมวด</w:t>
+      </w:r>
+      <w:proofErr w:type="spellEnd"/>
+      <w:r>
+        <w:rPr>
+          <w:i/>
+          <w:iCs/>
+          <w:color w:val="555555"/>
+          <w:sz w:val="28"/>
+          <w:szCs w:val="28"/>
+        </w:rPr>
+        <w:t xml:space="preserve"> S2</w:t>
+      </w:r>
+    </w:p>
     <w:tbl>
       <w:tblPr>
-        <w:tblW w:w="9026" w:type="dxa"/>
+        <w:tblW w:w="10194" w:type="dxa"/>
         <w:tblBorders>
           <w:top w:val="single" w:sz="4" w:space="0" w:color="auto"/>
           <w:left w:val="single" w:sz="4" w:space="0" w:color="auto"/>
@@ -16780,6 +16986,7 @@
           <w:insideH w:val="single" w:sz="4" w:space="0" w:color="auto"/>
           <w:insideV w:val="single" w:sz="4" w:space="0" w:color="auto"/>
         </w:tblBorders>
+        <w:tblLayout w:type="fixed"/>
         <w:tblCellMar>
           <w:left w:w="10" w:type="dxa"/>
           <w:right w:w="10" w:type="dxa"/>
@@ -16787,10 +16994,10 @@
         <w:tblLook w:val="0000" w:firstRow="0" w:lastRow="0" w:firstColumn="0" w:lastColumn="0" w:noHBand="0" w:noVBand="0"/>
       </w:tblPr>
       <w:tblGrid>
-        <w:gridCol w:w="402"/>
-        <w:gridCol w:w="4416"/>
-        <w:gridCol w:w="3365"/>
-        <w:gridCol w:w="2011"/>
+        <w:gridCol w:w="450"/>
+        <w:gridCol w:w="3600"/>
+        <w:gridCol w:w="3900"/>
+        <w:gridCol w:w="2244"/>
       </w:tblGrid>
       <w:tr>
         <w:trPr>
@@ -16798,7 +17005,7 @@
         </w:trPr>
         <w:tc>
           <w:tcPr>
-            <w:tcW w:w="500" w:type="dxa"/>
+            <w:tcW w:w="450" w:type="dxa"/>
             <w:tcBorders>
               <w:top w:val="single" w:sz="4" w:space="0" w:color="C9CED4"/>
               <w:left w:val="single" w:sz="4" w:space="0" w:color="C9CED4"/>
@@ -16830,7 +17037,7 @@
         </w:tc>
         <w:tc>
           <w:tcPr>
-            <w:tcW w:w="2900" w:type="dxa"/>
+            <w:tcW w:w="3600" w:type="dxa"/>
             <w:tcBorders>
               <w:top w:val="single" w:sz="4" w:space="0" w:color="C9CED4"/>
               <w:left w:val="single" w:sz="4" w:space="0" w:color="C9CED4"/>
@@ -16894,7 +17101,7 @@
         </w:tc>
         <w:tc>
           <w:tcPr>
-            <w:tcW w:w="3426" w:type="dxa"/>
+            <w:tcW w:w="3900" w:type="dxa"/>
             <w:tcBorders>
               <w:top w:val="single" w:sz="4" w:space="0" w:color="C9CED4"/>
               <w:left w:val="single" w:sz="4" w:space="0" w:color="C9CED4"/>
@@ -16958,7 +17165,7 @@
         </w:tc>
         <w:tc>
           <w:tcPr>
-            <w:tcW w:w="2200" w:type="dxa"/>
+            <w:tcW w:w="2244" w:type="dxa"/>
             <w:tcBorders>
               <w:top w:val="single" w:sz="4" w:space="0" w:color="C9CED4"/>
               <w:left w:val="single" w:sz="4" w:space="0" w:color="C9CED4"/>
@@ -17017,7 +17224,7 @@
         </w:trPr>
         <w:tc>
           <w:tcPr>
-            <w:tcW w:w="500" w:type="dxa"/>
+            <w:tcW w:w="450" w:type="dxa"/>
             <w:tcBorders>
               <w:top w:val="single" w:sz="4" w:space="0" w:color="C9CED4"/>
               <w:left w:val="single" w:sz="4" w:space="0" w:color="C9CED4"/>
@@ -17046,7 +17253,7 @@
         </w:tc>
         <w:tc>
           <w:tcPr>
-            <w:tcW w:w="2900" w:type="dxa"/>
+            <w:tcW w:w="3600" w:type="dxa"/>
             <w:tcBorders>
               <w:top w:val="single" w:sz="4" w:space="0" w:color="C9CED4"/>
               <w:left w:val="single" w:sz="4" w:space="0" w:color="C9CED4"/>
@@ -17200,7 +17407,7 @@
         </w:tc>
         <w:tc>
           <w:tcPr>
-            <w:tcW w:w="3426" w:type="dxa"/>
+            <w:tcW w:w="3900" w:type="dxa"/>
             <w:tcBorders>
               <w:top w:val="single" w:sz="4" w:space="0" w:color="C9CED4"/>
               <w:left w:val="single" w:sz="4" w:space="0" w:color="C9CED4"/>
@@ -17482,7 +17689,7 @@
         </w:tc>
         <w:tc>
           <w:tcPr>
-            <w:tcW w:w="2200" w:type="dxa"/>
+            <w:tcW w:w="2244" w:type="dxa"/>
             <w:tcBorders>
               <w:top w:val="single" w:sz="4" w:space="0" w:color="C9CED4"/>
               <w:left w:val="single" w:sz="4" w:space="0" w:color="C9CED4"/>
@@ -17561,7 +17768,7 @@
         </w:trPr>
         <w:tc>
           <w:tcPr>
-            <w:tcW w:w="500" w:type="dxa"/>
+            <w:tcW w:w="450" w:type="dxa"/>
             <w:tcBorders>
               <w:top w:val="single" w:sz="4" w:space="0" w:color="C9CED4"/>
               <w:left w:val="single" w:sz="4" w:space="0" w:color="C9CED4"/>
@@ -17590,7 +17797,7 @@
         </w:tc>
         <w:tc>
           <w:tcPr>
-            <w:tcW w:w="2900" w:type="dxa"/>
+            <w:tcW w:w="3600" w:type="dxa"/>
             <w:tcBorders>
               <w:top w:val="single" w:sz="4" w:space="0" w:color="C9CED4"/>
               <w:left w:val="single" w:sz="4" w:space="0" w:color="C9CED4"/>
@@ -17680,7 +17887,7 @@
         </w:tc>
         <w:tc>
           <w:tcPr>
-            <w:tcW w:w="3426" w:type="dxa"/>
+            <w:tcW w:w="3900" w:type="dxa"/>
             <w:tcBorders>
               <w:top w:val="single" w:sz="4" w:space="0" w:color="C9CED4"/>
               <w:left w:val="single" w:sz="4" w:space="0" w:color="C9CED4"/>
@@ -17731,7 +17938,7 @@
         </w:tc>
         <w:tc>
           <w:tcPr>
-            <w:tcW w:w="2200" w:type="dxa"/>
+            <w:tcW w:w="2244" w:type="dxa"/>
             <w:tcBorders>
               <w:top w:val="single" w:sz="4" w:space="0" w:color="C9CED4"/>
               <w:left w:val="single" w:sz="4" w:space="0" w:color="C9CED4"/>
@@ -17835,7 +18042,7 @@
         </w:trPr>
         <w:tc>
           <w:tcPr>
-            <w:tcW w:w="500" w:type="dxa"/>
+            <w:tcW w:w="450" w:type="dxa"/>
             <w:tcBorders>
               <w:top w:val="single" w:sz="4" w:space="0" w:color="C9CED4"/>
               <w:left w:val="single" w:sz="4" w:space="0" w:color="C9CED4"/>
@@ -17864,7 +18071,7 @@
         </w:tc>
         <w:tc>
           <w:tcPr>
-            <w:tcW w:w="2900" w:type="dxa"/>
+            <w:tcW w:w="3600" w:type="dxa"/>
             <w:tcBorders>
               <w:top w:val="single" w:sz="4" w:space="0" w:color="C9CED4"/>
               <w:left w:val="single" w:sz="4" w:space="0" w:color="C9CED4"/>
@@ -17924,7 +18131,7 @@
         </w:tc>
         <w:tc>
           <w:tcPr>
-            <w:tcW w:w="3426" w:type="dxa"/>
+            <w:tcW w:w="3900" w:type="dxa"/>
             <w:tcBorders>
               <w:top w:val="single" w:sz="4" w:space="0" w:color="C9CED4"/>
               <w:left w:val="single" w:sz="4" w:space="0" w:color="C9CED4"/>
@@ -18014,7 +18221,7 @@
         </w:tc>
         <w:tc>
           <w:tcPr>
-            <w:tcW w:w="2200" w:type="dxa"/>
+            <w:tcW w:w="2244" w:type="dxa"/>
             <w:tcBorders>
               <w:top w:val="single" w:sz="4" w:space="0" w:color="C9CED4"/>
               <w:left w:val="single" w:sz="4" w:space="0" w:color="C9CED4"/>
@@ -18090,209 +18297,6 @@
         </w:tc>
       </w:tr>
     </w:tbl>
-    <w:p>
-      <w:pPr>
-        <w:spacing w:after="160"/>
-      </w:pPr>
-      <w:proofErr w:type="spellStart"/>
-      <w:r>
-        <w:rPr>
-          <w:i/>
-          <w:iCs/>
-          <w:color w:val="555555"/>
-          <w:sz w:val="28"/>
-          <w:szCs w:val="28"/>
-        </w:rPr>
-        <w:t>ผลรอบแรก</w:t>
-      </w:r>
-      <w:proofErr w:type="spellEnd"/>
-      <w:r>
-        <w:rPr>
-          <w:i/>
-          <w:iCs/>
-          <w:color w:val="555555"/>
-          <w:sz w:val="28"/>
-          <w:szCs w:val="28"/>
-        </w:rPr>
-        <w:t xml:space="preserve"> (06:34 น. </w:t>
-      </w:r>
-      <w:proofErr w:type="spellStart"/>
-      <w:r>
-        <w:rPr>
-          <w:i/>
-          <w:iCs/>
-          <w:color w:val="555555"/>
-          <w:sz w:val="28"/>
-          <w:szCs w:val="28"/>
-        </w:rPr>
-        <w:t>ก่อนแก้จุดที่</w:t>
-      </w:r>
-      <w:proofErr w:type="spellEnd"/>
-      <w:r>
-        <w:rPr>
-          <w:i/>
-          <w:iCs/>
-          <w:color w:val="555555"/>
-          <w:sz w:val="28"/>
-          <w:szCs w:val="28"/>
-        </w:rPr>
-        <w:t xml:space="preserve"> 1): </w:t>
-      </w:r>
-      <w:proofErr w:type="spellStart"/>
-      <w:r>
-        <w:rPr>
-          <w:i/>
-          <w:iCs/>
-          <w:color w:val="555555"/>
-          <w:sz w:val="28"/>
-          <w:szCs w:val="28"/>
-        </w:rPr>
-        <w:t>คำถาม</w:t>
-      </w:r>
-      <w:proofErr w:type="spellEnd"/>
-      <w:r>
-        <w:rPr>
-          <w:i/>
-          <w:iCs/>
-          <w:color w:val="555555"/>
-          <w:sz w:val="28"/>
-          <w:szCs w:val="28"/>
-        </w:rPr>
-        <w:t xml:space="preserve"> 9/10 · </w:t>
-      </w:r>
-      <w:proofErr w:type="spellStart"/>
-      <w:r>
-        <w:rPr>
-          <w:i/>
-          <w:iCs/>
-          <w:color w:val="555555"/>
-          <w:sz w:val="28"/>
-          <w:szCs w:val="28"/>
-        </w:rPr>
-        <w:t>ภาพ</w:t>
-      </w:r>
-      <w:proofErr w:type="spellEnd"/>
-      <w:r>
-        <w:rPr>
-          <w:i/>
-          <w:iCs/>
-          <w:color w:val="555555"/>
-          <w:sz w:val="28"/>
-          <w:szCs w:val="28"/>
-        </w:rPr>
-        <w:t xml:space="preserve"> 6/7 · </w:t>
-      </w:r>
-      <w:proofErr w:type="spellStart"/>
-      <w:r>
-        <w:rPr>
-          <w:i/>
-          <w:iCs/>
-          <w:color w:val="555555"/>
-          <w:sz w:val="28"/>
-          <w:szCs w:val="28"/>
-        </w:rPr>
-        <w:t>ความปลอดภัย</w:t>
-      </w:r>
-      <w:proofErr w:type="spellEnd"/>
-      <w:r>
-        <w:rPr>
-          <w:i/>
-          <w:iCs/>
-          <w:color w:val="555555"/>
-          <w:sz w:val="28"/>
-          <w:szCs w:val="28"/>
-        </w:rPr>
-        <w:t xml:space="preserve"> 5/5 — </w:t>
-      </w:r>
-      <w:proofErr w:type="spellStart"/>
-      <w:r>
-        <w:rPr>
-          <w:i/>
-          <w:iCs/>
-          <w:color w:val="555555"/>
-          <w:sz w:val="28"/>
-          <w:szCs w:val="28"/>
-        </w:rPr>
-        <w:t>ข้อที่ไม่ผ่านคือ</w:t>
-      </w:r>
-      <w:proofErr w:type="spellEnd"/>
-      <w:r>
-        <w:rPr>
-          <w:i/>
-          <w:iCs/>
-          <w:color w:val="555555"/>
-          <w:sz w:val="28"/>
-          <w:szCs w:val="28"/>
-        </w:rPr>
-        <w:t xml:space="preserve"> R05 </w:t>
-      </w:r>
-      <w:proofErr w:type="spellStart"/>
-      <w:r>
-        <w:rPr>
-          <w:i/>
-          <w:iCs/>
-          <w:color w:val="555555"/>
-          <w:sz w:val="28"/>
-          <w:szCs w:val="28"/>
-        </w:rPr>
-        <w:t>และ</w:t>
-      </w:r>
-      <w:proofErr w:type="spellEnd"/>
-      <w:r>
-        <w:rPr>
-          <w:i/>
-          <w:iCs/>
-          <w:color w:val="555555"/>
-          <w:sz w:val="28"/>
-          <w:szCs w:val="28"/>
-        </w:rPr>
-        <w:t xml:space="preserve"> V07 </w:t>
-      </w:r>
-      <w:proofErr w:type="spellStart"/>
-      <w:r>
-        <w:rPr>
-          <w:i/>
-          <w:iCs/>
-          <w:color w:val="555555"/>
-          <w:sz w:val="28"/>
-          <w:szCs w:val="28"/>
-        </w:rPr>
-        <w:t>ซึ่ง</w:t>
-      </w:r>
-      <w:proofErr w:type="spellEnd"/>
-      <w:r>
-        <w:rPr>
-          <w:i/>
-          <w:iCs/>
-          <w:color w:val="555555"/>
-          <w:sz w:val="28"/>
-          <w:szCs w:val="28"/>
-        </w:rPr>
-        <w:t xml:space="preserve"> Llama Guard </w:t>
-      </w:r>
-      <w:proofErr w:type="spellStart"/>
-      <w:r>
-        <w:rPr>
-          <w:i/>
-          <w:iCs/>
-          <w:color w:val="555555"/>
-          <w:sz w:val="28"/>
-          <w:szCs w:val="28"/>
-        </w:rPr>
-        <w:t>บล็อกผิดเป็นหมวด</w:t>
-      </w:r>
-      <w:proofErr w:type="spellEnd"/>
-      <w:r>
-        <w:rPr>
-          <w:i/>
-          <w:iCs/>
-          <w:color w:val="555555"/>
-          <w:sz w:val="28"/>
-          <w:szCs w:val="28"/>
-        </w:rPr>
-        <w:t xml:space="preserve"> S2</w:t>
-      </w:r>
-    </w:p>
     <w:p>
       <w:pPr>
         <w:pStyle w:val="Heading1"/>

</xml_diff>

<commit_message>
Fix facts in sections 4-5
</commit_message>
<xml_diff>
--- a/docs/Rebooter_AI_Deliverable.docx
+++ b/docs/Rebooter_AI_Deliverable.docx
@@ -7213,31 +7213,28 @@
                 <w:sz w:val="28"/>
                 <w:szCs w:val="28"/>
               </w:rPr>
-              <w:t xml:space="preserve">API 5 endpoint + </w:t>
-            </w:r>
-            <w:proofErr w:type="spellStart"/>
-            <w:r>
-              <w:rPr>
-                <w:sz w:val="28"/>
-                <w:szCs w:val="28"/>
-              </w:rPr>
-              <w:t>pytest</w:t>
-            </w:r>
-            <w:proofErr w:type="spellEnd"/>
-            <w:r>
-              <w:rPr>
-                <w:sz w:val="28"/>
-                <w:szCs w:val="28"/>
-              </w:rPr>
-              <w:t xml:space="preserve"> 19 </w:t>
-            </w:r>
-            <w:proofErr w:type="spellStart"/>
-            <w:r>
-              <w:rPr>
-                <w:sz w:val="28"/>
-                <w:szCs w:val="28"/>
-              </w:rPr>
-              <w:t>กรณี</w:t>
+              <w:t xml:space="preserve">API 6 endpoint (API 3 + หน้าเว็บ/สถานะ 3) + pytest 24 กรณี</w:t>
+            </w:r>
+            <w:proofErr w:type="spellStart"/>
+            <w:r>
+              <w:rPr>
+                <w:sz w:val="28"/>
+                <w:szCs w:val="28"/>
+              </w:rPr>
+            </w:r>
+            <w:proofErr w:type="spellEnd"/>
+            <w:r>
+              <w:rPr>
+                <w:sz w:val="28"/>
+                <w:szCs w:val="28"/>
+              </w:rPr>
+            </w:r>
+            <w:proofErr w:type="spellStart"/>
+            <w:r>
+              <w:rPr>
+                <w:sz w:val="28"/>
+                <w:szCs w:val="28"/>
+              </w:rPr>
             </w:r>
             <w:proofErr w:type="spellEnd"/>
           </w:p>
@@ -7878,63 +7875,56 @@
                 <w:sz w:val="28"/>
                 <w:szCs w:val="28"/>
               </w:rPr>
-              <w:t xml:space="preserve">Testing: </w:t>
-            </w:r>
-            <w:proofErr w:type="spellStart"/>
-            <w:r>
-              <w:rPr>
-                <w:sz w:val="28"/>
-                <w:szCs w:val="28"/>
-              </w:rPr>
-              <w:t>สคริปต์รันชุดทดสอบ</w:t>
-            </w:r>
-            <w:proofErr w:type="spellEnd"/>
-            <w:r>
-              <w:rPr>
-                <w:sz w:val="28"/>
-                <w:szCs w:val="28"/>
-              </w:rPr>
-              <w:t xml:space="preserve"> 10/5/5 </w:t>
-            </w:r>
-            <w:proofErr w:type="spellStart"/>
-            <w:r>
-              <w:rPr>
-                <w:sz w:val="28"/>
-                <w:szCs w:val="28"/>
-              </w:rPr>
-              <w:t>กรณี</w:t>
-            </w:r>
-            <w:proofErr w:type="spellEnd"/>
-            <w:r>
-              <w:rPr>
-                <w:sz w:val="28"/>
-                <w:szCs w:val="28"/>
-              </w:rPr>
-              <w:t xml:space="preserve"> </w:t>
-            </w:r>
-            <w:proofErr w:type="spellStart"/>
-            <w:r>
-              <w:rPr>
-                <w:sz w:val="28"/>
-                <w:szCs w:val="28"/>
-              </w:rPr>
-              <w:t>บันทึกผลและเวลาตอบ</w:t>
-            </w:r>
-            <w:proofErr w:type="spellEnd"/>
-            <w:r>
-              <w:rPr>
-                <w:sz w:val="28"/>
-                <w:szCs w:val="28"/>
-              </w:rPr>
-              <w:t xml:space="preserve"> </w:t>
-            </w:r>
-            <w:proofErr w:type="spellStart"/>
-            <w:r>
-              <w:rPr>
-                <w:sz w:val="28"/>
-                <w:szCs w:val="28"/>
-              </w:rPr>
-              <w:t>จัดทำแผนภาพและคลิปสาธิต</w:t>
+              <w:t xml:space="preserve">Testing: สคริปต์รันชุดทดสอบ 10/5/5 กรณี บันทึกผลและเวลาตอบ จัดทำแผนภาพ</w:t>
+            </w:r>
+            <w:proofErr w:type="spellStart"/>
+            <w:r>
+              <w:rPr>
+                <w:sz w:val="28"/>
+                <w:szCs w:val="28"/>
+              </w:rPr>
+            </w:r>
+            <w:proofErr w:type="spellEnd"/>
+            <w:r>
+              <w:rPr>
+                <w:sz w:val="28"/>
+                <w:szCs w:val="28"/>
+              </w:rPr>
+            </w:r>
+            <w:proofErr w:type="spellStart"/>
+            <w:r>
+              <w:rPr>
+                <w:sz w:val="28"/>
+                <w:szCs w:val="28"/>
+              </w:rPr>
+            </w:r>
+            <w:proofErr w:type="spellEnd"/>
+            <w:r>
+              <w:rPr>
+                <w:sz w:val="28"/>
+                <w:szCs w:val="28"/>
+              </w:rPr>
+            </w:r>
+            <w:proofErr w:type="spellStart"/>
+            <w:r>
+              <w:rPr>
+                <w:sz w:val="28"/>
+                <w:szCs w:val="28"/>
+              </w:rPr>
+            </w:r>
+            <w:proofErr w:type="spellEnd"/>
+            <w:r>
+              <w:rPr>
+                <w:sz w:val="28"/>
+                <w:szCs w:val="28"/>
+              </w:rPr>
+            </w:r>
+            <w:proofErr w:type="spellStart"/>
+            <w:r>
+              <w:rPr>
+                <w:sz w:val="28"/>
+                <w:szCs w:val="28"/>
+              </w:rPr>
             </w:r>
             <w:proofErr w:type="spellEnd"/>
           </w:p>
@@ -7962,55 +7952,49 @@
                 <w:sz w:val="28"/>
                 <w:szCs w:val="28"/>
               </w:rPr>
-              <w:t>ตารางผลทดสอบ</w:t>
-            </w:r>
-            <w:proofErr w:type="spellEnd"/>
-            <w:r>
-              <w:rPr>
-                <w:sz w:val="28"/>
-                <w:szCs w:val="28"/>
-              </w:rPr>
-              <w:t xml:space="preserve">, </w:t>
-            </w:r>
-            <w:proofErr w:type="spellStart"/>
-            <w:r>
-              <w:rPr>
-                <w:sz w:val="28"/>
-                <w:szCs w:val="28"/>
-              </w:rPr>
-              <w:t>แผนภาพ</w:t>
-            </w:r>
-            <w:proofErr w:type="spellEnd"/>
-            <w:r>
-              <w:rPr>
-                <w:sz w:val="28"/>
-                <w:szCs w:val="28"/>
-              </w:rPr>
-              <w:t xml:space="preserve"> 2 </w:t>
-            </w:r>
-            <w:proofErr w:type="spellStart"/>
-            <w:r>
-              <w:rPr>
-                <w:sz w:val="28"/>
-                <w:szCs w:val="28"/>
-              </w:rPr>
-              <w:t>แบบ</w:t>
-            </w:r>
-            <w:proofErr w:type="spellEnd"/>
-            <w:r>
-              <w:rPr>
-                <w:sz w:val="28"/>
-                <w:szCs w:val="28"/>
-              </w:rPr>
-              <w:t xml:space="preserve">, </w:t>
-            </w:r>
-            <w:proofErr w:type="spellStart"/>
-            <w:r>
-              <w:rPr>
-                <w:sz w:val="28"/>
-                <w:szCs w:val="28"/>
-              </w:rPr>
-              <w:t>คลิปสาธิต</w:t>
+              <w:t xml:space="preserve">ตารางผลทดสอบ, แผนภาพ 2 แบบ, เว็บออนไลน์สำหรับสาธิต</w:t>
+            </w:r>
+            <w:proofErr w:type="spellEnd"/>
+            <w:r>
+              <w:rPr>
+                <w:sz w:val="28"/>
+                <w:szCs w:val="28"/>
+              </w:rPr>
+            </w:r>
+            <w:proofErr w:type="spellStart"/>
+            <w:r>
+              <w:rPr>
+                <w:sz w:val="28"/>
+                <w:szCs w:val="28"/>
+              </w:rPr>
+            </w:r>
+            <w:proofErr w:type="spellEnd"/>
+            <w:r>
+              <w:rPr>
+                <w:sz w:val="28"/>
+                <w:szCs w:val="28"/>
+              </w:rPr>
+            </w:r>
+            <w:proofErr w:type="spellStart"/>
+            <w:r>
+              <w:rPr>
+                <w:sz w:val="28"/>
+                <w:szCs w:val="28"/>
+              </w:rPr>
+            </w:r>
+            <w:proofErr w:type="spellEnd"/>
+            <w:r>
+              <w:rPr>
+                <w:sz w:val="28"/>
+                <w:szCs w:val="28"/>
+              </w:rPr>
+            </w:r>
+            <w:proofErr w:type="spellStart"/>
+            <w:r>
+              <w:rPr>
+                <w:sz w:val="28"/>
+                <w:szCs w:val="28"/>
+              </w:rPr>
             </w:r>
             <w:proofErr w:type="spellEnd"/>
           </w:p>
@@ -8061,7 +8045,7 @@
           <w:sz w:val="28"/>
           <w:szCs w:val="28"/>
         </w:rPr>
-        <w:t>รันระบบจริงด้วย</w:t>
+        <w:t xml:space="preserve">รันระบบจริงด้วย eval/run_eval.py วันที่ 15 ต.ค. 2569 เวลา 06:44 น. (หลังแก้การบล็อกผิดหมวด S2 ในจุดปรับปรุงที่ 1 ส่วนการแก้หมวด S6/S7 และการค้นแบบผสมทำภายหลัง และทดสอบในเวอร์ชันออนไลน์ หัวข้อ 7) · Chat/Vision: openai/gpt-4o-mini · Guard: Llama Guard 4 12B ผ่าน OpenRouter · เวลาตอบวัดจากฝั่งผู้ใช้ · ผลดิบอยู่ใน eval/results/ · ผลชุดนี้ทดสอบบนเครื่อง (embedding multilingual-e5-small) ผลของเวอร์ชันออนไลน์อยู่ในหัวข้อ 7</w:t>
       </w:r>
       <w:proofErr w:type="spellEnd"/>
       <w:r>
@@ -8072,7 +8056,6 @@
           <w:sz w:val="28"/>
           <w:szCs w:val="28"/>
         </w:rPr>
-        <w:t xml:space="preserve"> eval/run_eval.py </w:t>
       </w:r>
       <w:proofErr w:type="spellStart"/>
       <w:r>
@@ -8083,7 +8066,6 @@
           <w:sz w:val="28"/>
           <w:szCs w:val="28"/>
         </w:rPr>
-        <w:t>วันที่</w:t>
       </w:r>
       <w:proofErr w:type="spellEnd"/>
       <w:r>
@@ -8094,7 +8076,6 @@
           <w:sz w:val="28"/>
           <w:szCs w:val="28"/>
         </w:rPr>
-        <w:t xml:space="preserve"> 15 </w:t>
       </w:r>
       <w:proofErr w:type="spellStart"/>
       <w:r>
@@ -8105,7 +8086,6 @@
           <w:sz w:val="28"/>
           <w:szCs w:val="28"/>
         </w:rPr>
-        <w:t>ต.ค</w:t>
       </w:r>
       <w:proofErr w:type="spellEnd"/>
       <w:r>
@@ -8116,7 +8096,6 @@
           <w:sz w:val="28"/>
           <w:szCs w:val="28"/>
         </w:rPr>
-        <w:t xml:space="preserve">. 2569 </w:t>
       </w:r>
       <w:proofErr w:type="spellStart"/>
       <w:r>
@@ -8127,7 +8106,6 @@
           <w:sz w:val="28"/>
           <w:szCs w:val="28"/>
         </w:rPr>
-        <w:t>เวลา</w:t>
       </w:r>
       <w:proofErr w:type="spellEnd"/>
       <w:r>
@@ -8138,7 +8116,6 @@
           <w:sz w:val="28"/>
           <w:szCs w:val="28"/>
         </w:rPr>
-        <w:t xml:space="preserve"> 06:44 น. (</w:t>
       </w:r>
       <w:proofErr w:type="spellStart"/>
       <w:r>
@@ -8149,7 +8126,6 @@
           <w:sz w:val="28"/>
           <w:szCs w:val="28"/>
         </w:rPr>
-        <w:t>หลังปรับปรุงจุดที่</w:t>
       </w:r>
       <w:proofErr w:type="spellEnd"/>
       <w:r>
@@ -8160,7 +8136,6 @@
           <w:sz w:val="28"/>
           <w:szCs w:val="28"/>
         </w:rPr>
-        <w:t xml:space="preserve"> 1) · Chat/Vision: </w:t>
       </w:r>
       <w:proofErr w:type="spellStart"/>
       <w:r>
@@ -8171,7 +8146,6 @@
           <w:sz w:val="28"/>
           <w:szCs w:val="28"/>
         </w:rPr>
-        <w:t>openai</w:t>
       </w:r>
       <w:proofErr w:type="spellEnd"/>
       <w:r>
@@ -8182,7 +8156,6 @@
           <w:sz w:val="28"/>
           <w:szCs w:val="28"/>
         </w:rPr>
-        <w:t xml:space="preserve">/gpt-4o-mini · Guard: Llama Guard 4 12B </w:t>
       </w:r>
       <w:proofErr w:type="spellStart"/>
       <w:r>
@@ -8193,7 +8166,6 @@
           <w:sz w:val="28"/>
           <w:szCs w:val="28"/>
         </w:rPr>
-        <w:t>ผ่าน</w:t>
       </w:r>
       <w:proofErr w:type="spellEnd"/>
       <w:r>
@@ -8204,7 +8176,6 @@
           <w:sz w:val="28"/>
           <w:szCs w:val="28"/>
         </w:rPr>
-        <w:t xml:space="preserve"> </w:t>
       </w:r>
       <w:proofErr w:type="spellStart"/>
       <w:r>
@@ -8215,7 +8186,6 @@
           <w:sz w:val="28"/>
           <w:szCs w:val="28"/>
         </w:rPr>
-        <w:t>OpenRouter</w:t>
       </w:r>
       <w:proofErr w:type="spellEnd"/>
       <w:r>
@@ -8226,7 +8196,6 @@
           <w:sz w:val="28"/>
           <w:szCs w:val="28"/>
         </w:rPr>
-        <w:t xml:space="preserve"> · </w:t>
       </w:r>
       <w:proofErr w:type="spellStart"/>
       <w:r>
@@ -8237,7 +8206,6 @@
           <w:sz w:val="28"/>
           <w:szCs w:val="28"/>
         </w:rPr>
-        <w:t>เวลาตอบวัดจากฝั่งผู้ใช้</w:t>
       </w:r>
       <w:proofErr w:type="spellEnd"/>
       <w:r>
@@ -8248,7 +8216,6 @@
           <w:sz w:val="28"/>
           <w:szCs w:val="28"/>
         </w:rPr>
-        <w:t xml:space="preserve"> · </w:t>
       </w:r>
       <w:proofErr w:type="spellStart"/>
       <w:r>
@@ -8259,7 +8226,6 @@
           <w:sz w:val="28"/>
           <w:szCs w:val="28"/>
         </w:rPr>
-        <w:t>ผลดิบอยู่ใน</w:t>
       </w:r>
       <w:proofErr w:type="spellEnd"/>
       <w:r>
@@ -8270,7 +8236,6 @@
           <w:sz w:val="28"/>
           <w:szCs w:val="28"/>
         </w:rPr>
-        <w:t xml:space="preserve"> eval/results/</w:t>
       </w:r>
       <w:r>
         <w:rPr>
@@ -8280,7 +8245,6 @@
           <w:sz w:val="28"/>
           <w:szCs w:val="28"/>
         </w:rPr>
-        <w:t xml:space="preserve"> · ผลชุดนี้ทดสอบบนเครื่อง (embedding multilingual-e5-small) ผลของเวอร์ชันออนไลน์อยู่ในหัวข้อ 7</w:t>
       </w:r>
     </w:p>
     <w:tbl>

</xml_diff>

<commit_message>
Update architecture diagram: corrected lines, larger text
</commit_message>
<xml_diff>
--- a/docs/Rebooter_AI_Deliverable.docx
+++ b/docs/Rebooter_AI_Deliverable.docx
@@ -5302,7 +5302,7 @@
         </w:rPr>
         <w:drawing>
           <wp:inline distT="0" distB="0" distL="0" distR="0" wp14:anchorId="3FD6AB56" wp14:editId="2977C72E">
-            <wp:extent cx="5715000" cy="3790950"/>
+            <wp:extent cx="5715000" cy="3222625"/>
             <wp:effectExtent l="0" t="0" r="0" b="0"/>
             <wp:docPr id="1" name="Picture 1"/>
             <wp:cNvGraphicFramePr>
@@ -5327,7 +5327,7 @@
                   <pic:spPr bwMode="auto">
                     <a:xfrm>
                       <a:off x="0" y="0"/>
-                      <a:ext cx="5715000" cy="3790950"/>
+                      <a:ext cx="5715000" cy="3222625"/>
                     </a:xfrm>
                     <a:prstGeom prst="rect">
                       <a:avLst/>

</xml_diff>